<commit_message>
Atualiza proposta: texto em primeira pessoa, fonte de dados e rotulagem híbrida
</commit_message>
<xml_diff>
--- a/reports/proposta.docx
+++ b/reports/proposta.docx
@@ -193,7 +193,13 @@
         <w:rPr>
           <w:lang w:val="pt-BR"/>
         </w:rPr>
-        <w:t>Este projeto propõe classificar automaticamente manchetes financeiras em português como boas, ruins ou neutras para o investidor da empresa citada, identificar as entidades mencionadas e permitir consultar os resultados em linguagem natural.</w:t>
+        <w:t>Nosso</w:t>
+      </w:r>
+      <w:r>
+        <w:rPr>
+          <w:lang w:val="pt-BR"/>
+        </w:rPr>
+        <w:t xml:space="preserve"> projeto propõe classificar automaticamente manchetes financeiras em português como boas, ruins ou neutras para o investidor da empresa citada, identificar as entidades mencionadas e permitir consultar os resultados em linguagem natural.</w:t>
       </w:r>
     </w:p>
     <w:p>
@@ -221,7 +227,55 @@
         <w:rPr>
           <w:lang w:val="pt-BR"/>
         </w:rPr>
-        <w:t>Notícias influenciam diretamente o preço dos ativos, e reagir tarde a uma informação relevante pode gerar perdas. O tema surgiu da experiência das integrantes, que atuam no time de tecnologia de uma empresa do mercado financeiro e acompanham de perto a rotina repetitiva do time de gestão, que lê manualmente dezenas de notícias por dia.</w:t>
+        <w:t xml:space="preserve">Notícias influenciam diretamente o preço dos ativos, e reagir tarde a uma informação relevante pode gerar perdas. O tema surgiu </w:t>
+      </w:r>
+      <w:r>
+        <w:rPr>
+          <w:lang w:val="pt-BR"/>
+        </w:rPr>
+        <w:t>da nossa experiência</w:t>
+      </w:r>
+      <w:r>
+        <w:rPr>
+          <w:lang w:val="pt-BR"/>
+        </w:rPr>
+        <w:t xml:space="preserve"> no time de tecnologia </w:t>
+      </w:r>
+      <w:r>
+        <w:rPr>
+          <w:lang w:val="pt-BR"/>
+        </w:rPr>
+        <w:t>d</w:t>
+      </w:r>
+      <w:r>
+        <w:rPr>
+          <w:lang w:val="pt-BR"/>
+        </w:rPr>
+        <w:t>o</w:t>
+      </w:r>
+      <w:r>
+        <w:rPr>
+          <w:lang w:val="pt-BR"/>
+        </w:rPr>
+        <w:t xml:space="preserve"> mercado</w:t>
+      </w:r>
+      <w:r>
+        <w:rPr>
+          <w:lang w:val="pt-BR"/>
+        </w:rPr>
+        <w:t xml:space="preserve"> financeiro e acompanha</w:t>
+      </w:r>
+      <w:r>
+        <w:rPr>
+          <w:lang w:val="pt-BR"/>
+        </w:rPr>
+        <w:t>mos</w:t>
+      </w:r>
+      <w:r>
+        <w:rPr>
+          <w:lang w:val="pt-BR"/>
+        </w:rPr>
+        <w:t xml:space="preserve"> de perto a rotina repetitiva do time de gestão, que lê manualmente dezenas de notícias por dia.</w:t>
       </w:r>
     </w:p>
     <w:p>
@@ -357,7 +411,7 @@
         <w:rPr>
           <w:lang w:val="pt-BR"/>
         </w:rPr>
-        <w:t>Rotular manualmente uma amostra para treino e avaliação.</w:t>
+        <w:t>Montar uma base rotulada para treino e avaliação, combinando um dataset público com uma amostra de manchetes revisada por nós.</w:t>
       </w:r>
     </w:p>
     <w:p>
@@ -516,7 +570,7 @@
         <w:rPr>
           <w:lang w:val="pt-BR"/>
         </w:rPr>
-        <w:t>Fonte: feeds RSS de portais financeiros em português (como InfoMoney, Money Times, Exame e g1 Economia). Serão guardados apenas manchete, link, data e fonte, sem copiar o texto das matérias. A carteira será fictícia, com cerca de 20 empresas líquidas da B3; nenhum dado interno de gestora será usado.</w:t>
+        <w:t>Fonte: feeds RSS de portais financeiros em português (InfoMoney, Money Times, Exame e g1 Economia) e a busca do Google News por empresa, que concentrou a maior parte das manchetes (cerca de 1.700 citando a carteira). Serão guardados apenas manchete, link, data e fonte, sem copiar o texto das matérias. A carteira é fictícia, formada pelas 20 maiores empresas da B3 por valor de mercado; nenhum dado interno de gestora será usado.</w:t>
       </w:r>
     </w:p>
     <w:p>
@@ -530,7 +584,7 @@
         <w:rPr>
           <w:lang w:val="pt-BR"/>
         </w:rPr>
-        <w:t>Rotulagem: de 500 a 1.000 manchetes serão rotuladas pelas integrantes segundo um guia escrito previamente, cuja regra central é o impacto provável para o acionista. A base será dividida em treino, validação e teste; o repositório terá apenas o código de coleta e uma pequena amostra, respeitando os termos de uso dos portais.</w:t>
+        <w:t xml:space="preserve">Rotulagem: nossa base de teste terá 200 manchetes do projeto, com rótulo sugerido por IA generativa e revisado por nós segundo um guia escrito, cuja regra central é o impacto provável para o acionista. Para o treino, combinaremos um dataset público rotulado por humanos (lucas-leme/Sentiments-FinBERT-PT-BR, cerca de 500 textos) com as demais manchetes coletadas, rotuladas automaticamente pelo FinBERT-PT-BR. Manchetes do teste e suas quase-duplicatas ficam fora do treino, e a validação é separada do treino. O repositório terá apenas o código de coleta e uma pequena amostra.</w:t>
       </w:r>
     </w:p>
     <w:p>
@@ -971,7 +1025,13 @@
         <w:rPr>
           <w:lang w:val="pt-BR"/>
         </w:rPr>
-        <w:t>O grupo implementará a coleta, a rotulagem, as regras de NER, a rede neural, o fine-</w:t>
+        <w:t>Implementaremos</w:t>
+      </w:r>
+      <w:r>
+        <w:rPr>
+          <w:lang w:val="pt-BR"/>
+        </w:rPr>
+        <w:t xml:space="preserve"> a coleta, a rotulagem, as regras de NER, a rede neural, o fine-</w:t>
       </w:r>
       <w:proofErr w:type="spellStart"/>
       <w:r>

</xml_diff>